<commit_message>
Corrige sumario do documento (lista fixa com numeros de pagina reais)
</commit_message>
<xml_diff>
--- a/docs/TCC-Enrico-Alencar-Tomaz.docx
+++ b/docs/TCC-Enrico-Alencar-Tomaz.docx
@@ -141,47 +141,356 @@
         <w:t>2. SUMÁRIO</w:t>
       </w:r>
     </w:p>
-    <w:sdt>
-      <w:sdtPr>
-        <w:docPartObj>
-          <w:docPartGallery w:val="Table of Contents"/>
-          <w:docPartUnique w:val="true"/>
-        </w:docPartObj>
-      </w:sdtPr>
-      <w:sdtContent>
-        <w:p>
-          <w:pPr>
-            <w:pStyle w:val="Normal"/>
-            <w:rPr/>
-          </w:pPr>
-          <w:r>
-            <w:fldChar w:fldCharType="begin"/>
-          </w:r>
-          <w:r>
-            <w:rPr/>
-            <w:instrText> TOC \o "1-3" \h</w:instrText>
-          </w:r>
-          <w:r>
-            <w:rPr/>
-            <w:fldChar w:fldCharType="separate"/>
-          </w:r>
-          <w:r>
-            <w:rPr/>
-          </w:r>
-          <w:r>
-            <w:rPr/>
-            <w:fldChar w:fldCharType="end"/>
-          </w:r>
-        </w:p>
-      </w:sdtContent>
-    </w:sdt>
     <w:p>
       <w:pPr>
         <w:pStyle w:val="Normal"/>
-        <w:rPr/>
-      </w:pPr>
-      <w:r>
-        <w:rPr/>
+        <w:tabs>
+          <w:tab w:val="clear" w:pos="720"/>
+          <w:tab w:val="right" w:pos="9020" w:leader="dot"/>
+        </w:tabs>
+        <w:spacing w:before="0" w:after="120"/>
+        <w:ind w:left="0" w:hanging="0"/>
+        <w:rPr/>
+      </w:pPr>
+      <w:r>
+        <w:rPr>
+          <w:rFonts w:eastAsia="Calibri" w:cs="Calibri"/>
+          <w:sz w:val="22"/>
+          <w:szCs w:val="22"/>
+        </w:rPr>
+        <w:t>1. RESUMO</w:t>
+        <w:tab/>
+        <w:t>2</w:t>
+      </w:r>
+    </w:p>
+    <w:p>
+      <w:pPr>
+        <w:pStyle w:val="Normal"/>
+        <w:tabs>
+          <w:tab w:val="clear" w:pos="720"/>
+          <w:tab w:val="right" w:pos="9020" w:leader="dot"/>
+        </w:tabs>
+        <w:spacing w:before="0" w:after="120"/>
+        <w:ind w:left="0" w:hanging="0"/>
+        <w:rPr/>
+      </w:pPr>
+      <w:r>
+        <w:rPr>
+          <w:rFonts w:eastAsia="Calibri" w:cs="Calibri"/>
+          <w:sz w:val="22"/>
+          <w:szCs w:val="22"/>
+        </w:rPr>
+        <w:t>2. SUMÁRIO</w:t>
+        <w:tab/>
+        <w:t>3</w:t>
+      </w:r>
+    </w:p>
+    <w:p>
+      <w:pPr>
+        <w:pStyle w:val="Normal"/>
+        <w:tabs>
+          <w:tab w:val="clear" w:pos="720"/>
+          <w:tab w:val="right" w:pos="9020" w:leader="dot"/>
+        </w:tabs>
+        <w:spacing w:before="0" w:after="120"/>
+        <w:ind w:left="0" w:hanging="0"/>
+        <w:rPr/>
+      </w:pPr>
+      <w:r>
+        <w:rPr>
+          <w:rFonts w:eastAsia="Calibri" w:cs="Calibri"/>
+          <w:sz w:val="22"/>
+          <w:szCs w:val="22"/>
+        </w:rPr>
+        <w:t>3. INTRODUÇÃO</w:t>
+        <w:tab/>
+        <w:t>4</w:t>
+      </w:r>
+    </w:p>
+    <w:p>
+      <w:pPr>
+        <w:pStyle w:val="Normal"/>
+        <w:tabs>
+          <w:tab w:val="clear" w:pos="720"/>
+          <w:tab w:val="right" w:pos="9020" w:leader="dot"/>
+        </w:tabs>
+        <w:spacing w:before="0" w:after="120"/>
+        <w:ind w:left="0" w:hanging="0"/>
+        <w:rPr/>
+      </w:pPr>
+      <w:r>
+        <w:rPr>
+          <w:rFonts w:eastAsia="Calibri" w:cs="Calibri"/>
+          <w:sz w:val="22"/>
+          <w:szCs w:val="22"/>
+        </w:rPr>
+        <w:t>4. O PROJETO</w:t>
+        <w:tab/>
+        <w:t>5</w:t>
+      </w:r>
+    </w:p>
+    <w:p>
+      <w:pPr>
+        <w:pStyle w:val="Normal"/>
+        <w:tabs>
+          <w:tab w:val="clear" w:pos="720"/>
+          <w:tab w:val="right" w:pos="9020" w:leader="dot"/>
+        </w:tabs>
+        <w:spacing w:before="0" w:after="120"/>
+        <w:ind w:left="300" w:hanging="0"/>
+        <w:rPr/>
+      </w:pPr>
+      <w:r>
+        <w:rPr>
+          <w:rFonts w:eastAsia="Calibri" w:cs="Calibri"/>
+          <w:sz w:val="22"/>
+          <w:szCs w:val="22"/>
+        </w:rPr>
+        <w:t>4.1 Estratégia de teste</w:t>
+        <w:tab/>
+        <w:t>5</w:t>
+      </w:r>
+    </w:p>
+    <w:p>
+      <w:pPr>
+        <w:pStyle w:val="Normal"/>
+        <w:tabs>
+          <w:tab w:val="clear" w:pos="720"/>
+          <w:tab w:val="right" w:pos="9020" w:leader="dot"/>
+        </w:tabs>
+        <w:spacing w:before="0" w:after="120"/>
+        <w:ind w:left="300" w:hanging="0"/>
+        <w:rPr/>
+      </w:pPr>
+      <w:r>
+        <w:rPr>
+          <w:rFonts w:eastAsia="Calibri" w:cs="Calibri"/>
+          <w:sz w:val="22"/>
+          <w:szCs w:val="22"/>
+        </w:rPr>
+        <w:t>4.2 Critérios de aceitação</w:t>
+        <w:tab/>
+        <w:t>7</w:t>
+      </w:r>
+    </w:p>
+    <w:p>
+      <w:pPr>
+        <w:pStyle w:val="Normal"/>
+        <w:tabs>
+          <w:tab w:val="clear" w:pos="720"/>
+          <w:tab w:val="right" w:pos="9020" w:leader="dot"/>
+        </w:tabs>
+        <w:spacing w:before="0" w:after="120"/>
+        <w:ind w:left="300" w:hanging="0"/>
+        <w:rPr/>
+      </w:pPr>
+      <w:r>
+        <w:rPr>
+          <w:rFonts w:eastAsia="Calibri" w:cs="Calibri"/>
+          <w:sz w:val="22"/>
+          <w:szCs w:val="22"/>
+        </w:rPr>
+        <w:t>4.3 Casos de testes</w:t>
+        <w:tab/>
+        <w:t>14</w:t>
+      </w:r>
+    </w:p>
+    <w:p>
+      <w:pPr>
+        <w:pStyle w:val="Normal"/>
+        <w:tabs>
+          <w:tab w:val="clear" w:pos="720"/>
+          <w:tab w:val="right" w:pos="9020" w:leader="dot"/>
+        </w:tabs>
+        <w:spacing w:before="0" w:after="120"/>
+        <w:ind w:left="300" w:hanging="0"/>
+        <w:rPr/>
+      </w:pPr>
+      <w:r>
+        <w:rPr>
+          <w:rFonts w:eastAsia="Calibri" w:cs="Calibri"/>
+          <w:sz w:val="22"/>
+          <w:szCs w:val="22"/>
+        </w:rPr>
+        <w:t>4.4 Repositório no Github</w:t>
+        <w:tab/>
+        <w:t>17</w:t>
+      </w:r>
+    </w:p>
+    <w:p>
+      <w:pPr>
+        <w:pStyle w:val="Normal"/>
+        <w:tabs>
+          <w:tab w:val="clear" w:pos="720"/>
+          <w:tab w:val="right" w:pos="9020" w:leader="dot"/>
+        </w:tabs>
+        <w:spacing w:before="0" w:after="120"/>
+        <w:ind w:left="300" w:hanging="0"/>
+        <w:rPr/>
+      </w:pPr>
+      <w:r>
+        <w:rPr>
+          <w:rFonts w:eastAsia="Calibri" w:cs="Calibri"/>
+          <w:sz w:val="22"/>
+          <w:szCs w:val="22"/>
+        </w:rPr>
+        <w:t>4.5 Testes automatizados</w:t>
+        <w:tab/>
+        <w:t>18</w:t>
+      </w:r>
+    </w:p>
+    <w:p>
+      <w:pPr>
+        <w:pStyle w:val="Normal"/>
+        <w:tabs>
+          <w:tab w:val="clear" w:pos="720"/>
+          <w:tab w:val="right" w:pos="9020" w:leader="dot"/>
+        </w:tabs>
+        <w:spacing w:before="0" w:after="120"/>
+        <w:ind w:left="600" w:hanging="0"/>
+        <w:rPr/>
+      </w:pPr>
+      <w:r>
+        <w:rPr>
+          <w:rFonts w:eastAsia="Calibri" w:cs="Calibri"/>
+          <w:sz w:val="22"/>
+          <w:szCs w:val="22"/>
+        </w:rPr>
+        <w:t>4.5.1 Automação de UI</w:t>
+        <w:tab/>
+        <w:t>18</w:t>
+      </w:r>
+    </w:p>
+    <w:p>
+      <w:pPr>
+        <w:pStyle w:val="Normal"/>
+        <w:tabs>
+          <w:tab w:val="clear" w:pos="720"/>
+          <w:tab w:val="right" w:pos="9020" w:leader="dot"/>
+        </w:tabs>
+        <w:spacing w:before="0" w:after="120"/>
+        <w:ind w:left="600" w:hanging="0"/>
+        <w:rPr/>
+      </w:pPr>
+      <w:r>
+        <w:rPr>
+          <w:rFonts w:eastAsia="Calibri" w:cs="Calibri"/>
+          <w:sz w:val="22"/>
+          <w:szCs w:val="22"/>
+        </w:rPr>
+        <w:t>4.5.2 Automação de API</w:t>
+        <w:tab/>
+        <w:t>19</w:t>
+      </w:r>
+    </w:p>
+    <w:p>
+      <w:pPr>
+        <w:pStyle w:val="Normal"/>
+        <w:tabs>
+          <w:tab w:val="clear" w:pos="720"/>
+          <w:tab w:val="right" w:pos="9020" w:leader="dot"/>
+        </w:tabs>
+        <w:spacing w:before="0" w:after="120"/>
+        <w:ind w:left="600" w:hanging="0"/>
+        <w:rPr/>
+      </w:pPr>
+      <w:r>
+        <w:rPr>
+          <w:rFonts w:eastAsia="Calibri" w:cs="Calibri"/>
+          <w:sz w:val="22"/>
+          <w:szCs w:val="22"/>
+        </w:rPr>
+        <w:t>4.5.3 Automação Mobile</w:t>
+        <w:tab/>
+        <w:t>19</w:t>
+      </w:r>
+    </w:p>
+    <w:p>
+      <w:pPr>
+        <w:pStyle w:val="Normal"/>
+        <w:tabs>
+          <w:tab w:val="clear" w:pos="720"/>
+          <w:tab w:val="right" w:pos="9020" w:leader="dot"/>
+        </w:tabs>
+        <w:spacing w:before="0" w:after="120"/>
+        <w:ind w:left="300" w:hanging="0"/>
+        <w:rPr/>
+      </w:pPr>
+      <w:r>
+        <w:rPr>
+          <w:rFonts w:eastAsia="Calibri" w:cs="Calibri"/>
+          <w:sz w:val="22"/>
+          <w:szCs w:val="22"/>
+        </w:rPr>
+        <w:t>4.6 Integração contínua</w:t>
+        <w:tab/>
+        <w:t>20</w:t>
+      </w:r>
+    </w:p>
+    <w:p>
+      <w:pPr>
+        <w:pStyle w:val="Normal"/>
+        <w:tabs>
+          <w:tab w:val="clear" w:pos="720"/>
+          <w:tab w:val="right" w:pos="9020" w:leader="dot"/>
+        </w:tabs>
+        <w:spacing w:before="0" w:after="120"/>
+        <w:ind w:left="300" w:hanging="0"/>
+        <w:rPr/>
+      </w:pPr>
+      <w:r>
+        <w:rPr>
+          <w:rFonts w:eastAsia="Calibri" w:cs="Calibri"/>
+          <w:sz w:val="22"/>
+          <w:szCs w:val="22"/>
+        </w:rPr>
+        <w:t>4.7 Testes de performance</w:t>
+        <w:tab/>
+        <w:t>21</w:t>
+      </w:r>
+    </w:p>
+    <w:p>
+      <w:pPr>
+        <w:pStyle w:val="Normal"/>
+        <w:tabs>
+          <w:tab w:val="clear" w:pos="720"/>
+          <w:tab w:val="right" w:pos="9020" w:leader="dot"/>
+        </w:tabs>
+        <w:spacing w:before="0" w:after="120"/>
+        <w:ind w:left="0" w:hanging="0"/>
+        <w:rPr/>
+      </w:pPr>
+      <w:r>
+        <w:rPr>
+          <w:rFonts w:eastAsia="Calibri" w:cs="Calibri"/>
+          <w:sz w:val="22"/>
+          <w:szCs w:val="22"/>
+        </w:rPr>
+        <w:t>5. CONCLUSÃO</w:t>
+        <w:tab/>
+        <w:t>22</w:t>
+      </w:r>
+    </w:p>
+    <w:p>
+      <w:pPr>
+        <w:pStyle w:val="Normal"/>
+        <w:tabs>
+          <w:tab w:val="clear" w:pos="720"/>
+          <w:tab w:val="right" w:pos="9020" w:leader="dot"/>
+        </w:tabs>
+        <w:spacing w:before="0" w:after="120"/>
+        <w:ind w:left="0" w:hanging="0"/>
+        <w:rPr/>
+      </w:pPr>
+      <w:r>
+        <w:rPr>
+          <w:rFonts w:eastAsia="Calibri" w:cs="Calibri"/>
+          <w:sz w:val="22"/>
+          <w:szCs w:val="22"/>
+        </w:rPr>
+        <w:t>6. REFERÊNCIAS BIBLIOGRÁFICAS</w:t>
+        <w:tab/>
+        <w:t>23</w:t>
       </w:r>
     </w:p>
     <w:p>
@@ -855,12 +1164,12 @@
           <wp:anchor behindDoc="0" distT="0" distB="0" distL="0" distR="0" simplePos="0" locked="0" layoutInCell="1" allowOverlap="1" relativeHeight="2">
             <wp:simplePos x="0" y="0"/>
             <wp:positionH relativeFrom="column">
-              <wp:posOffset>-114300</wp:posOffset>
+              <wp:posOffset>171450</wp:posOffset>
             </wp:positionH>
             <wp:positionV relativeFrom="paragraph">
-              <wp:posOffset>15240</wp:posOffset>
+              <wp:posOffset>180975</wp:posOffset>
             </wp:positionV>
-            <wp:extent cx="5731510" cy="2588895"/>
+            <wp:extent cx="5731510" cy="2620010"/>
             <wp:effectExtent l="0" t="0" r="0" b="0"/>
             <wp:wrapSquare wrapText="largest"/>
             <wp:docPr id="1" name="Figura1" descr=""/>
@@ -885,7 +1194,7 @@
                   <pic:spPr bwMode="auto">
                     <a:xfrm>
                       <a:off x="0" y="0"/>
-                      <a:ext cx="5731510" cy="2588895"/>
+                      <a:ext cx="5731510" cy="2620010"/>
                     </a:xfrm>
                     <a:prstGeom prst="rect">
                       <a:avLst/>

</xml_diff>